<commit_message>
Xác thuc va phan quyen
</commit_message>
<xml_diff>
--- a/thesis/doc/BaoCaoTienDoTuan1_TaHangVu_110123203.docx
+++ b/thesis/doc/BaoCaoTienDoTuan1_TaHangVu_110123203.docx
@@ -132,7 +132,7 @@
         </w:trPr>
         <w:tc>
           <w:tcPr>
-            <w:tcW w:w="822" w:type="dxa"/>
+            <w:tcW w:w="834" w:type="dxa"/>
             <w:tcBorders>
               <w:top w:val="single" w:sz="4" w:space="0" w:color="000000"/>
               <w:left w:val="single" w:sz="4" w:space="0" w:color="000000"/>
@@ -160,7 +160,7 @@
         </w:tc>
         <w:tc>
           <w:tcPr>
-            <w:tcW w:w="2733" w:type="dxa"/>
+            <w:tcW w:w="2774" w:type="dxa"/>
             <w:tcBorders>
               <w:top w:val="single" w:sz="4" w:space="0" w:color="000000"/>
               <w:right w:val="single" w:sz="4" w:space="0" w:color="000000"/>
@@ -192,7 +192,7 @@
         </w:tc>
         <w:tc>
           <w:tcPr>
-            <w:tcW w:w="11015" w:type="dxa"/>
+            <w:tcW w:w="11178" w:type="dxa"/>
             <w:gridSpan w:val="3"/>
             <w:tcBorders>
               <w:top w:val="single" w:sz="4" w:space="0" w:color="000000"/>
@@ -229,7 +229,7 @@
         </w:trPr>
         <w:tc>
           <w:tcPr>
-            <w:tcW w:w="822" w:type="dxa"/>
+            <w:tcW w:w="834" w:type="dxa"/>
             <w:tcBorders>
               <w:left w:val="single" w:sz="4" w:space="0" w:color="000000"/>
             </w:tcBorders>
@@ -257,7 +257,7 @@
         </w:tc>
         <w:tc>
           <w:tcPr>
-            <w:tcW w:w="2733" w:type="dxa"/>
+            <w:tcW w:w="2774" w:type="dxa"/>
             <w:tcBorders>
               <w:right w:val="single" w:sz="4" w:space="0" w:color="000000"/>
             </w:tcBorders>
@@ -299,7 +299,7 @@
         </w:tc>
         <w:tc>
           <w:tcPr>
-            <w:tcW w:w="11015" w:type="dxa"/>
+            <w:tcW w:w="11178" w:type="dxa"/>
             <w:gridSpan w:val="3"/>
             <w:tcBorders>
               <w:top w:val="single" w:sz="8" w:space="0" w:color="FFFFFF"/>
@@ -453,7 +453,7 @@
         </w:trPr>
         <w:tc>
           <w:tcPr>
-            <w:tcW w:w="822" w:type="dxa"/>
+            <w:tcW w:w="834" w:type="dxa"/>
             <w:tcBorders>
               <w:left w:val="single" w:sz="4" w:space="0" w:color="000000"/>
             </w:tcBorders>
@@ -481,7 +481,7 @@
         </w:tc>
         <w:tc>
           <w:tcPr>
-            <w:tcW w:w="2733" w:type="dxa"/>
+            <w:tcW w:w="2774" w:type="dxa"/>
             <w:tcBorders>
               <w:right w:val="single" w:sz="4" w:space="0" w:color="000000"/>
             </w:tcBorders>
@@ -505,7 +505,7 @@
         </w:tc>
         <w:tc>
           <w:tcPr>
-            <w:tcW w:w="11015" w:type="dxa"/>
+            <w:tcW w:w="11178" w:type="dxa"/>
             <w:gridSpan w:val="3"/>
             <w:tcBorders>
               <w:top w:val="single" w:sz="8" w:space="0" w:color="FFFFFF"/>
@@ -578,7 +578,7 @@
         </w:trPr>
         <w:tc>
           <w:tcPr>
-            <w:tcW w:w="822" w:type="dxa"/>
+            <w:tcW w:w="834" w:type="dxa"/>
             <w:tcBorders>
               <w:top w:val="single" w:sz="4" w:space="0" w:color="000000"/>
               <w:left w:val="single" w:sz="4" w:space="0" w:color="000000"/>
@@ -607,7 +607,7 @@
         </w:tc>
         <w:tc>
           <w:tcPr>
-            <w:tcW w:w="13748" w:type="dxa"/>
+            <w:tcW w:w="13952" w:type="dxa"/>
             <w:gridSpan w:val="4"/>
             <w:tcBorders>
               <w:top w:val="single" w:sz="4" w:space="0" w:color="000000"/>
@@ -647,7 +647,7 @@
         </w:trPr>
         <w:tc>
           <w:tcPr>
-            <w:tcW w:w="14570" w:type="dxa"/>
+            <w:tcW w:w="14786" w:type="dxa"/>
             <w:gridSpan w:val="5"/>
             <w:tcBorders>
               <w:left w:val="single" w:sz="4" w:space="0" w:color="000000"/>
@@ -1427,7 +1427,7 @@
         </w:trPr>
         <w:tc>
           <w:tcPr>
-            <w:tcW w:w="822" w:type="dxa"/>
+            <w:tcW w:w="834" w:type="dxa"/>
             <w:tcBorders>
               <w:top w:val="single" w:sz="4" w:space="0" w:color="000000"/>
               <w:left w:val="single" w:sz="4" w:space="0" w:color="000000"/>
@@ -1456,7 +1456,7 @@
         </w:tc>
         <w:tc>
           <w:tcPr>
-            <w:tcW w:w="13748" w:type="dxa"/>
+            <w:tcW w:w="13952" w:type="dxa"/>
             <w:gridSpan w:val="4"/>
             <w:tcBorders>
               <w:top w:val="single" w:sz="4" w:space="0" w:color="000000"/>
@@ -1496,7 +1496,7 @@
         </w:trPr>
         <w:tc>
           <w:tcPr>
-            <w:tcW w:w="14570" w:type="dxa"/>
+            <w:tcW w:w="14786" w:type="dxa"/>
             <w:gridSpan w:val="5"/>
             <w:tcBorders>
               <w:left w:val="single" w:sz="4" w:space="0" w:color="000000"/>
@@ -2144,7 +2144,7 @@
         </w:trPr>
         <w:tc>
           <w:tcPr>
-            <w:tcW w:w="822" w:type="dxa"/>
+            <w:tcW w:w="834" w:type="dxa"/>
             <w:tcBorders>
               <w:top w:val="single" w:sz="4" w:space="0" w:color="000000"/>
               <w:left w:val="single" w:sz="4" w:space="0" w:color="000000"/>
@@ -2174,7 +2174,7 @@
         </w:tc>
         <w:tc>
           <w:tcPr>
-            <w:tcW w:w="13748" w:type="dxa"/>
+            <w:tcW w:w="13952" w:type="dxa"/>
             <w:gridSpan w:val="4"/>
             <w:tcBorders>
               <w:top w:val="single" w:sz="4" w:space="0" w:color="000000"/>
@@ -2215,7 +2215,7 @@
         </w:trPr>
         <w:tc>
           <w:tcPr>
-            <w:tcW w:w="14570" w:type="dxa"/>
+            <w:tcW w:w="14786" w:type="dxa"/>
             <w:gridSpan w:val="5"/>
             <w:tcBorders>
               <w:top w:val="single" w:sz="4" w:space="0" w:color="000000"/>
@@ -2314,7 +2314,7 @@
         </w:trPr>
         <w:tc>
           <w:tcPr>
-            <w:tcW w:w="6431" w:type="dxa"/>
+            <w:tcW w:w="6527" w:type="dxa"/>
             <w:gridSpan w:val="3"/>
             <w:tcBorders>
               <w:top w:val="single" w:sz="4" w:space="0" w:color="000000"/>
@@ -2337,7 +2337,7 @@
         </w:tc>
         <w:tc>
           <w:tcPr>
-            <w:tcW w:w="6437" w:type="dxa"/>
+            <w:tcW w:w="6532" w:type="dxa"/>
             <w:tcBorders>
               <w:top w:val="single" w:sz="4" w:space="0" w:color="000000"/>
             </w:tcBorders>
@@ -2471,7 +2471,7 @@
         </w:tc>
         <w:tc>
           <w:tcPr>
-            <w:tcW w:w="1702" w:type="dxa"/>
+            <w:tcW w:w="1727" w:type="dxa"/>
             <w:tcMar>
               <w:left w:w="0" w:type="dxa"/>
               <w:right w:w="0" w:type="dxa"/>
@@ -2502,10 +2502,43 @@
           <w:lang w:val="de-DE" w:eastAsia="zh-TW"/>
         </w:rPr>
       </w:pPr>
+      <w:r>
+        <w:rPr>
+          <w:rFonts w:eastAsia="PMingLiU"/>
+          <w:noProof/>
+          <w:szCs w:val="22"/>
+          <w:lang w:val="de-DE" w:eastAsia="zh-TW"/>
+        </w:rPr>
+        <w:lastRenderedPageBreak/>
+        <w:pict w14:anchorId="34A7934B">
+          <v:shapetype id="_x0000_t75" coordsize="21600,21600" o:spt="75" o:preferrelative="t" path="m@4@5l@4@11@9@11@9@5xe" filled="f" stroked="f">
+            <v:stroke joinstyle="miter"/>
+            <v:formulas>
+              <v:f eqn="if lineDrawn pixelLineWidth 0"/>
+              <v:f eqn="sum @0 1 0"/>
+              <v:f eqn="sum 0 0 @1"/>
+              <v:f eqn="prod @2 1 2"/>
+              <v:f eqn="prod @3 21600 pixelWidth"/>
+              <v:f eqn="prod @3 21600 pixelHeight"/>
+              <v:f eqn="sum @0 0 1"/>
+              <v:f eqn="prod @6 1 2"/>
+              <v:f eqn="prod @7 21600 pixelWidth"/>
+              <v:f eqn="sum @8 21600 0"/>
+              <v:f eqn="prod @7 21600 pixelHeight"/>
+              <v:f eqn="sum @10 21600 0"/>
+            </v:formulas>
+            <v:path o:extrusionok="f" gradientshapeok="t" o:connecttype="rect"/>
+            <o:lock v:ext="edit" aspectratio="t"/>
+          </v:shapetype>
+          <v:shape id="Picture 1" o:spid="_x0000_i1025" type="#_x0000_t75" style="width:729pt;height:388.8pt;visibility:visible;mso-wrap-style:square">
+            <v:imagedata r:id="rId7" o:title=""/>
+          </v:shape>
+        </w:pict>
+      </w:r>
     </w:p>
     <w:sectPr>
-      <w:footerReference w:type="default" r:id="rId7"/>
-      <w:footerReference w:type="first" r:id="rId8"/>
+      <w:footerReference w:type="default" r:id="rId8"/>
+      <w:footerReference w:type="first" r:id="rId9"/>
       <w:pgSz w:w="16838" w:h="11906" w:orient="landscape"/>
       <w:pgMar w:top="1701" w:right="1134" w:bottom="1134" w:left="1134" w:header="0" w:footer="720" w:gutter="0"/>
       <w:cols w:space="720"/>

</xml_diff>

<commit_message>
deploy thu lan 1
</commit_message>
<xml_diff>
--- a/thesis/doc/BaoCaoTienDoTuan1_TaHangVu_110123203.docx
+++ b/thesis/doc/BaoCaoTienDoTuan1_TaHangVu_110123203.docx
@@ -32,6 +32,51 @@
                 <w:lang w:val="de-DE" w:eastAsia="zh-TW"/>
               </w:rPr>
             </w:pPr>
+            <w:r>
+              <w:rPr>
+                <w:rFonts w:eastAsia="PMingLiU"/>
+                <w:noProof/>
+                <w:szCs w:val="28"/>
+                <w:lang w:val="de-DE" w:eastAsia="zh-TW"/>
+              </w:rPr>
+              <w:pict w14:anchorId="33B2A5F4">
+                <v:shapetype id="_x0000_t75" coordsize="21600,21600" o:spt="75" o:preferrelative="t" path="m@4@5l@4@11@9@11@9@5xe" filled="f" stroked="f">
+                  <v:stroke joinstyle="miter"/>
+                  <v:formulas>
+                    <v:f eqn="if lineDrawn pixelLineWidth 0"/>
+                    <v:f eqn="sum @0 1 0"/>
+                    <v:f eqn="sum 0 0 @1"/>
+                    <v:f eqn="prod @2 1 2"/>
+                    <v:f eqn="prod @3 21600 pixelWidth"/>
+                    <v:f eqn="prod @3 21600 pixelHeight"/>
+                    <v:f eqn="sum @0 0 1"/>
+                    <v:f eqn="prod @6 1 2"/>
+                    <v:f eqn="prod @7 21600 pixelWidth"/>
+                    <v:f eqn="sum @8 21600 0"/>
+                    <v:f eqn="prod @7 21600 pixelHeight"/>
+                    <v:f eqn="sum @10 21600 0"/>
+                  </v:formulas>
+                  <v:path o:extrusionok="f" gradientshapeok="t" o:connecttype="rect"/>
+                  <o:lock v:ext="edit" aspectratio="t"/>
+                </v:shapetype>
+                <v:shape id="_x0000_i1028" type="#_x0000_t75" style="width:563.4pt;height:223.2pt;visibility:visible;mso-wrap-style:square">
+                  <v:imagedata r:id="rId7" o:title=""/>
+                </v:shape>
+              </w:pict>
+            </w:r>
+            <w:r>
+              <w:rPr>
+                <w:rFonts w:eastAsia="PMingLiU"/>
+                <w:noProof/>
+                <w:szCs w:val="28"/>
+                <w:lang w:val="de-DE" w:eastAsia="zh-TW"/>
+              </w:rPr>
+              <w:pict w14:anchorId="0F006825">
+                <v:shape id="_x0000_i1025" type="#_x0000_t75" style="width:563.4pt;height:42pt;visibility:visible;mso-wrap-style:square">
+                  <v:imagedata r:id="rId8" o:title=""/>
+                </v:shape>
+              </w:pict>
+            </w:r>
             <w:r>
               <w:rPr>
                 <w:rFonts w:eastAsia="PMingLiU"/>
@@ -415,6 +460,7 @@
                 <w:szCs w:val="26"/>
                 <w:lang w:val="de-DE"/>
               </w:rPr>
+              <w:lastRenderedPageBreak/>
               <w:t>Email: hangvuzxjv@gmail.com</w:t>
             </w:r>
           </w:p>
@@ -1373,7 +1419,16 @@
                       <w:szCs w:val="26"/>
                       <w:lang w:val="de-DE" w:eastAsia="zh-TW"/>
                     </w:rPr>
-                    <w:t>Thiết kế giao diện (UI/UX) cho phân hệ Khách hàng và Quản trị; rà soát, tổng hợp và điều chỉnh các nội dung chưa thống nhất.</w:t>
+                    <w:t xml:space="preserve">Thiết kế giao diện (UI/UX) cho phân hệ Khách hàng và Quản trị; rà </w:t>
+                  </w:r>
+                  <w:r>
+                    <w:rPr>
+                      <w:sz w:val="26"/>
+                      <w:szCs w:val="26"/>
+                      <w:lang w:val="de-DE" w:eastAsia="zh-TW"/>
+                    </w:rPr>
+                    <w:lastRenderedPageBreak/>
+                    <w:t>soát, tổng hợp và điều chỉnh các nội dung chưa thống nhất.</w:t>
                   </w:r>
                 </w:p>
               </w:tc>
@@ -1403,7 +1458,17 @@
                       <w:szCs w:val="26"/>
                       <w:lang w:val="de-DE" w:eastAsia="zh-TW"/>
                     </w:rPr>
-                    <w:t>Wireframe giao diện; hoàn thành thiết kế cơ bản, sẵn sàng triển khai Tuần 2.</w:t>
+                    <w:lastRenderedPageBreak/>
+                    <w:t xml:space="preserve">Wireframe giao diện; </w:t>
+                  </w:r>
+                  <w:r>
+                    <w:rPr>
+                      <w:sz w:val="26"/>
+                      <w:szCs w:val="26"/>
+                      <w:lang w:val="de-DE" w:eastAsia="zh-TW"/>
+                    </w:rPr>
+                    <w:lastRenderedPageBreak/>
+                    <w:t>hoàn thành thiết kế cơ bản, sẵn sàng triển khai Tuần 2.</w:t>
                   </w:r>
                 </w:p>
               </w:tc>
@@ -2288,6 +2353,7 @@
                 <w:szCs w:val="26"/>
                 <w:lang w:val="de-DE"/>
               </w:rPr>
+              <w:lastRenderedPageBreak/>
               <w:t>Đề xuất: Tiếp tục tìm hiểu cách thiết kế cơ sở dữ liệu MySQL. Mong giảng viên hướng dẫn góp ý về chức năng, phân quyền và cấu trúc dữ liệu để hoàn thiện hệ thống theo đúng yêu cầu đề tài.</w:t>
             </w:r>
           </w:p>
@@ -2511,34 +2577,28 @@
         </w:rPr>
         <w:lastRenderedPageBreak/>
         <w:pict w14:anchorId="34A7934B">
-          <v:shapetype id="_x0000_t75" coordsize="21600,21600" o:spt="75" o:preferrelative="t" path="m@4@5l@4@11@9@11@9@5xe" filled="f" stroked="f">
-            <v:stroke joinstyle="miter"/>
-            <v:formulas>
-              <v:f eqn="if lineDrawn pixelLineWidth 0"/>
-              <v:f eqn="sum @0 1 0"/>
-              <v:f eqn="sum 0 0 @1"/>
-              <v:f eqn="prod @2 1 2"/>
-              <v:f eqn="prod @3 21600 pixelWidth"/>
-              <v:f eqn="prod @3 21600 pixelHeight"/>
-              <v:f eqn="sum @0 0 1"/>
-              <v:f eqn="prod @6 1 2"/>
-              <v:f eqn="prod @7 21600 pixelWidth"/>
-              <v:f eqn="sum @8 21600 0"/>
-              <v:f eqn="prod @7 21600 pixelHeight"/>
-              <v:f eqn="sum @10 21600 0"/>
-            </v:formulas>
-            <v:path o:extrusionok="f" gradientshapeok="t" o:connecttype="rect"/>
-            <o:lock v:ext="edit" aspectratio="t"/>
-          </v:shapetype>
-          <v:shape id="Picture 1" o:spid="_x0000_i1025" type="#_x0000_t75" style="width:729pt;height:388.8pt;visibility:visible;mso-wrap-style:square">
-            <v:imagedata r:id="rId7" o:title=""/>
+          <v:shape id="Picture 1" o:spid="_x0000_i1026" type="#_x0000_t75" style="width:729pt;height:388.8pt;visibility:visible;mso-wrap-style:square">
+            <v:imagedata r:id="rId9" o:title=""/>
+          </v:shape>
+        </w:pict>
+      </w:r>
+      <w:r>
+        <w:rPr>
+          <w:rFonts w:eastAsia="PMingLiU"/>
+          <w:noProof/>
+          <w:szCs w:val="22"/>
+          <w:lang w:val="de-DE" w:eastAsia="zh-TW"/>
+        </w:rPr>
+        <w:pict w14:anchorId="0BE80C0B">
+          <v:shape id="_x0000_i1027" type="#_x0000_t75" style="width:728.4pt;height:54pt;visibility:visible;mso-wrap-style:square">
+            <v:imagedata r:id="rId8" o:title=""/>
           </v:shape>
         </w:pict>
       </w:r>
     </w:p>
     <w:sectPr>
-      <w:footerReference w:type="default" r:id="rId8"/>
-      <w:footerReference w:type="first" r:id="rId9"/>
+      <w:footerReference w:type="default" r:id="rId10"/>
+      <w:footerReference w:type="first" r:id="rId11"/>
       <w:pgSz w:w="16838" w:h="11906" w:orient="landscape"/>
       <w:pgMar w:top="1701" w:right="1134" w:bottom="1134" w:left="1134" w:header="0" w:footer="720" w:gutter="0"/>
       <w:cols w:space="720"/>

</xml_diff>